<commit_message>
chore: update targeted resume DOCX (email and contact line)
Made-with: Cursor
</commit_message>
<xml_diff>
--- a/resumes/Zukowski_Targeted_Resume_Versions_No_Orphans/Zukowski_Resume_Asset_Management.docx
+++ b/resumes/Zukowski_Targeted_Resume_Versions_No_Orphans/Zukowski_Resume_Asset_Management.docx
@@ -31,7 +31,7 @@
           <w:sz w:val="19"/>
           <w:szCs w:val="19"/>
         </w:rPr>
-        <w:t xml:space="preserve">Orlando, FL | zach@cryptozach.com | 321-236-2261</w:t>
+        <w:t xml:space="preserve">Orlando, FL | zach@tokenization.systems | 321-236-2261</w:t>
       </w:r>
     </w:p>
     <w:p>
@@ -47,7 +47,7 @@
             <w:sz w:val="19"/>
             <w:szCs w:val="19"/>
           </w:rPr>
-          <w:t xml:space="preserve">cryptozach.com</w:t>
+          <w:t xml:space="preserve">tokenization.systems</w:t>
         </w:r>
       </w:hyperlink>
       <w:r>

</xml_diff>